<commit_message>
Update social links and Word resume from latest resume source
</commit_message>
<xml_diff>
--- a/public/Padmanaban_Resume.docx
+++ b/public/Padmanaban_Resume.docx
@@ -40,7 +40,9 @@
         </w:rPr>
         <w:t>Tiruppur, Tamil Nadu | +91 6383023497 | padmanabanponnusamy701@gmail.com</w:t>
         <w:br/>
-        <w:t>LinkedIn: https://www.linkedin.com/in/padmanaban-p-28290b188</w:t>
+        <w:t>LinkedIn: linkedin.com/in/padmanaban-p-28290b188 | GitHub: github.com/padmanaban701</w:t>
+        <w:br/>
+        <w:t>Portfolio: padhuport.vercel.app</w:t>
       </w:r>
     </w:p>
     <w:p>

</xml_diff>